<commit_message>
Unit 2 reference: continuous f-block strip, exception marking removed, organized diagram box
Co-Authored-By: Claude Opus 5.5 <noreply@anthropic.com>
Claude-Session: https://claude.ai/code/session_01LaT1EarAMnh5opQoFahNzN
</commit_message>
<xml_diff>
--- a/output/chem-u02/Unit 2 Reference - Periodic Table by Sublevel.docx
+++ b/output/chem-u02/Unit 2 Reference - Periodic Table by Sublevel.docx
@@ -919,7 +919,7 @@
                 <w:sz w:val="13"/>
                 <w:u w:val="none"/>
               </w:rPr>
-              <w:t>valence = the outer s electrons (2 for most; 1 for Cr and Cu)</w:t>
+              <w:t>valence = the electrons in the outer s sublevel</w:t>
             </w:r>
           </w:p>
         </w:tc>
@@ -1193,7 +1193,7 @@
             <w:vMerge w:val="restart"/>
             <w:vAlign w:val="top"/>
             <w:tcMar>
-              <w:top w:w="30" w:type="dxa"/>
+              <w:top w:w="20" w:type="dxa"/>
               <w:left w:w="60" w:type="dxa"/>
               <w:bottom w:w="0" w:type="dxa"/>
               <w:right w:w="40" w:type="dxa"/>
@@ -1208,16 +1208,116 @@
               <w:tblLayout w:type="fixed"/>
             </w:tblPr>
             <w:tblGrid>
-              <w:gridCol w:w="2520"/>
-              <w:gridCol w:w="5328"/>
+              <w:gridCol w:w="2232"/>
+              <w:gridCol w:w="2880"/>
+              <w:gridCol w:w="2592"/>
             </w:tblGrid>
+            <w:tr>
+              <w:trPr>
+                <w:cantSplit/>
+                <w:trHeight w:val="273" w:hRule="exact"/>
+              </w:trPr>
+              <w:tc>
+                <w:tcPr>
+                  <w:tcW w:type="dxa" w:w="2232"/>
+                  <w:tcBorders>
+                    <w:bottom w:val="single" w:sz="10" w:color="4D730E"/>
+                  </w:tcBorders>
+                  <w:vAlign w:val="center"/>
+                  <w:tcMar>
+                    <w:top w:w="0" w:type="dxa"/>
+                    <w:left w:w="10" w:type="dxa"/>
+                    <w:bottom w:w="0" w:type="dxa"/>
+                    <w:right w:w="10" w:type="dxa"/>
+                  </w:tcMar>
+                </w:tcPr>
+                <w:p>
+                  <w:pPr>
+                    <w:spacing w:after="0"/>
+                    <w:jc w:val="left"/>
+                  </w:pPr>
+                  <w:r>
+                    <w:rPr>
+                      <w:rFonts w:ascii="Trade Gothic Next" w:hAnsi="Trade Gothic Next"/>
+                      <w:b/>
+                      <w:color w:val="4D730E"/>
+                      <w:sz w:val="13"/>
+                      <w:u w:val="none"/>
+                    </w:rPr>
+                    <w:t>DIAGONAL RULE</w:t>
+                  </w:r>
+                </w:p>
+              </w:tc>
+              <w:tc>
+                <w:tcPr>
+                  <w:tcW w:type="dxa" w:w="2880"/>
+                  <w:tcBorders>
+                    <w:bottom w:val="single" w:sz="10" w:color="4D730E"/>
+                  </w:tcBorders>
+                  <w:vAlign w:val="center"/>
+                  <w:tcMar>
+                    <w:top w:w="0" w:type="dxa"/>
+                    <w:left w:w="10" w:type="dxa"/>
+                    <w:bottom w:w="0" w:type="dxa"/>
+                    <w:right w:w="10" w:type="dxa"/>
+                  </w:tcMar>
+                </w:tcPr>
+                <w:p>
+                  <w:pPr>
+                    <w:spacing w:after="0"/>
+                    <w:jc w:val="left"/>
+                  </w:pPr>
+                  <w:r>
+                    <w:rPr>
+                      <w:rFonts w:ascii="Trade Gothic Next" w:hAnsi="Trade Gothic Next"/>
+                      <w:b/>
+                      <w:color w:val="4D730E"/>
+                      <w:sz w:val="13"/>
+                      <w:u w:val="none"/>
+                    </w:rPr>
+                    <w:t>FILLING ORDER, ROW BY ROW</w:t>
+                  </w:r>
+                </w:p>
+              </w:tc>
+              <w:tc>
+                <w:tcPr>
+                  <w:tcW w:type="dxa" w:w="2592"/>
+                  <w:tcBorders>
+                    <w:bottom w:val="single" w:sz="10" w:color="4D730E"/>
+                  </w:tcBorders>
+                  <w:vAlign w:val="center"/>
+                  <w:tcMar>
+                    <w:top w:w="0" w:type="dxa"/>
+                    <w:left w:w="10" w:type="dxa"/>
+                    <w:bottom w:w="0" w:type="dxa"/>
+                    <w:right w:w="10" w:type="dxa"/>
+                  </w:tcMar>
+                </w:tcPr>
+                <w:p>
+                  <w:pPr>
+                    <w:spacing w:after="0"/>
+                    <w:jc w:val="left"/>
+                  </w:pPr>
+                  <w:r>
+                    <w:rPr>
+                      <w:rFonts w:ascii="Trade Gothic Next" w:hAnsi="Trade Gothic Next"/>
+                      <w:b/>
+                      <w:color w:val="4D730E"/>
+                      <w:sz w:val="13"/>
+                      <w:u w:val="none"/>
+                    </w:rPr>
+                    <w:t>SUBLEVEL CAPACITY</w:t>
+                  </w:r>
+                </w:p>
+              </w:tc>
+            </w:tr>
             <w:tr>
               <w:tc>
                 <w:tcPr>
-                  <w:tcW w:type="dxa" w:w="2520"/>
-                  <w:vAlign w:val="center"/>
+                  <w:tcW w:type="dxa" w:w="2232"/>
+                  <w:vAlign w:val="top"/>
                   <w:tcMar>
-                    <w:top w:w="0" w:type="dxa"/>
+                    <w:top w:w="20" w:type="dxa"/>
                     <w:left w:w="0" w:type="dxa"/>
                     <w:bottom w:w="0" w:type="dxa"/>
                     <w:right w:w="0" w:type="dxa"/>
@@ -1230,7 +1330,7 @@
                   <w:r>
                     <w:drawing>
                       <wp:inline xmlns:a="http://schemas.openxmlformats.org/drawingml/2006/main" xmlns:pic="http://schemas.openxmlformats.org/drawingml/2006/picture">
-                        <wp:extent cx="1193470" cy="1371600"/>
+                        <wp:extent cx="891124" cy="1024128"/>
                         <wp:docPr id="1" name="Picture 1"/>
                         <wp:cNvGraphicFramePr>
                           <a:graphicFrameLocks noChangeAspect="1"/>
@@ -1251,7 +1351,7 @@
                               <pic:spPr>
                                 <a:xfrm>
                                   <a:off x="0" y="0"/>
-                                  <a:ext cx="1193470" cy="1371600"/>
+                                  <a:ext cx="891124" cy="1024128"/>
                                 </a:xfrm>
                                 <a:prstGeom prst="rect"/>
                               </pic:spPr>
@@ -1265,29 +1365,22 @@
               </w:tc>
               <w:tc>
                 <w:tcPr>
-                  <w:tcW w:type="dxa" w:w="5328"/>
-                  <w:vAlign w:val="center"/>
+                  <w:tcW w:type="dxa" w:w="2880"/>
+                  <w:vAlign w:val="top"/>
                   <w:tcMar>
-                    <w:top w:w="0" w:type="dxa"/>
-                    <w:left w:w="80" w:type="dxa"/>
+                    <w:top w:w="40" w:type="dxa"/>
+                    <w:left w:w="60" w:type="dxa"/>
                     <w:bottom w:w="0" w:type="dxa"/>
                     <w:right w:w="0" w:type="dxa"/>
                   </w:tcMar>
                 </w:tcPr>
                 <w:p>
                   <w:pPr>
-                    <w:spacing w:after="40"/>
+                    <w:tabs>
+                      <w:tab w:pos="720" w:val="left"/>
+                    </w:tabs>
+                    <w:spacing w:after="20"/>
                   </w:pPr>
-                  <w:r>
-                    <w:rPr>
-                      <w:rFonts w:ascii="Trade Gothic Next" w:hAnsi="Trade Gothic Next"/>
-                      <w:b/>
-                      <w:color w:val="4D730E"/>
-                      <w:sz w:val="13"/>
-                      <w:u w:val="none"/>
-                    </w:rPr>
-                    <w:t xml:space="preserve">FILLING ORDER  </w:t>
-                  </w:r>
                   <w:r>
                     <w:rPr>
                       <w:rFonts w:ascii="Trade Gothic Next" w:hAnsi="Trade Gothic Next"/>
@@ -1296,23 +1389,210 @@
                       <w:sz w:val="14"/>
                       <w:u w:val="none"/>
                     </w:rPr>
-                    <w:t>follow each arrow, top to bottom</w:t>
+                    <w:t>Row 1</w:t>
                   </w:r>
-                </w:p>
-                <w:p>
-                  <w:pPr>
-                    <w:spacing w:after="60"/>
-                  </w:pPr>
                   <w:r>
                     <w:rPr>
                       <w:rFonts w:ascii="Trade Gothic Next" w:hAnsi="Trade Gothic Next"/>
                       <w:b/>
                       <w:color w:val="14161B"/>
-                      <w:sz w:val="15"/>
+                      <w:sz w:val="16"/>
                       <w:u w:val="none"/>
                     </w:rPr>
-                    <w:t>1s 2s 2p 3s 3p 4s 3d 4p 5s 4d 5p 6s 4f 5d 6p 7s 5f 6d 7p</w:t>
+                    <w:tab/>
+                    <w:t>1s</w:t>
                   </w:r>
+                </w:p>
+                <w:p>
+                  <w:pPr>
+                    <w:tabs>
+                      <w:tab w:pos="720" w:val="left"/>
+                    </w:tabs>
+                    <w:spacing w:after="20"/>
+                  </w:pPr>
+                  <w:r>
+                    <w:rPr>
+                      <w:rFonts w:ascii="Trade Gothic Next" w:hAnsi="Trade Gothic Next"/>
+                      <w:b w:val="0"/>
+                      <w:color w:val="55604F"/>
+                      <w:sz w:val="14"/>
+                      <w:u w:val="none"/>
+                    </w:rPr>
+                    <w:t>Row 2</w:t>
+                  </w:r>
+                  <w:r>
+                    <w:rPr>
+                      <w:rFonts w:ascii="Trade Gothic Next" w:hAnsi="Trade Gothic Next"/>
+                      <w:b/>
+                      <w:color w:val="14161B"/>
+                      <w:sz w:val="16"/>
+                      <w:u w:val="none"/>
+                    </w:rPr>
+                    <w:tab/>
+                    <w:t>2s  2p</w:t>
+                  </w:r>
+                </w:p>
+                <w:p>
+                  <w:pPr>
+                    <w:tabs>
+                      <w:tab w:pos="720" w:val="left"/>
+                    </w:tabs>
+                    <w:spacing w:after="20"/>
+                  </w:pPr>
+                  <w:r>
+                    <w:rPr>
+                      <w:rFonts w:ascii="Trade Gothic Next" w:hAnsi="Trade Gothic Next"/>
+                      <w:b w:val="0"/>
+                      <w:color w:val="55604F"/>
+                      <w:sz w:val="14"/>
+                      <w:u w:val="none"/>
+                    </w:rPr>
+                    <w:t>Row 3</w:t>
+                  </w:r>
+                  <w:r>
+                    <w:rPr>
+                      <w:rFonts w:ascii="Trade Gothic Next" w:hAnsi="Trade Gothic Next"/>
+                      <w:b/>
+                      <w:color w:val="14161B"/>
+                      <w:sz w:val="16"/>
+                      <w:u w:val="none"/>
+                    </w:rPr>
+                    <w:tab/>
+                    <w:t>3s  3p</w:t>
+                  </w:r>
+                </w:p>
+                <w:p>
+                  <w:pPr>
+                    <w:tabs>
+                      <w:tab w:pos="720" w:val="left"/>
+                    </w:tabs>
+                    <w:spacing w:after="20"/>
+                  </w:pPr>
+                  <w:r>
+                    <w:rPr>
+                      <w:rFonts w:ascii="Trade Gothic Next" w:hAnsi="Trade Gothic Next"/>
+                      <w:b w:val="0"/>
+                      <w:color w:val="55604F"/>
+                      <w:sz w:val="14"/>
+                      <w:u w:val="none"/>
+                    </w:rPr>
+                    <w:t>Row 4</w:t>
+                  </w:r>
+                  <w:r>
+                    <w:rPr>
+                      <w:rFonts w:ascii="Trade Gothic Next" w:hAnsi="Trade Gothic Next"/>
+                      <w:b/>
+                      <w:color w:val="14161B"/>
+                      <w:sz w:val="16"/>
+                      <w:u w:val="none"/>
+                    </w:rPr>
+                    <w:tab/>
+                    <w:t>4s  3d  4p</w:t>
+                  </w:r>
+                </w:p>
+                <w:p>
+                  <w:pPr>
+                    <w:tabs>
+                      <w:tab w:pos="720" w:val="left"/>
+                    </w:tabs>
+                    <w:spacing w:after="20"/>
+                  </w:pPr>
+                  <w:r>
+                    <w:rPr>
+                      <w:rFonts w:ascii="Trade Gothic Next" w:hAnsi="Trade Gothic Next"/>
+                      <w:b w:val="0"/>
+                      <w:color w:val="55604F"/>
+                      <w:sz w:val="14"/>
+                      <w:u w:val="none"/>
+                    </w:rPr>
+                    <w:t>Row 5</w:t>
+                  </w:r>
+                  <w:r>
+                    <w:rPr>
+                      <w:rFonts w:ascii="Trade Gothic Next" w:hAnsi="Trade Gothic Next"/>
+                      <w:b/>
+                      <w:color w:val="14161B"/>
+                      <w:sz w:val="16"/>
+                      <w:u w:val="none"/>
+                    </w:rPr>
+                    <w:tab/>
+                    <w:t>5s  4d  5p</w:t>
+                  </w:r>
+                </w:p>
+                <w:p>
+                  <w:pPr>
+                    <w:tabs>
+                      <w:tab w:pos="720" w:val="left"/>
+                    </w:tabs>
+                    <w:spacing w:after="20"/>
+                  </w:pPr>
+                  <w:r>
+                    <w:rPr>
+                      <w:rFonts w:ascii="Trade Gothic Next" w:hAnsi="Trade Gothic Next"/>
+                      <w:b w:val="0"/>
+                      <w:color w:val="55604F"/>
+                      <w:sz w:val="14"/>
+                      <w:u w:val="none"/>
+                    </w:rPr>
+                    <w:t>Row 6</w:t>
+                  </w:r>
+                  <w:r>
+                    <w:rPr>
+                      <w:rFonts w:ascii="Trade Gothic Next" w:hAnsi="Trade Gothic Next"/>
+                      <w:b/>
+                      <w:color w:val="14161B"/>
+                      <w:sz w:val="16"/>
+                      <w:u w:val="none"/>
+                    </w:rPr>
+                    <w:tab/>
+                    <w:t>6s  4f  5d  6p</w:t>
+                  </w:r>
+                </w:p>
+                <w:p>
+                  <w:pPr>
+                    <w:tabs>
+                      <w:tab w:pos="720" w:val="left"/>
+                    </w:tabs>
+                    <w:spacing w:after="20"/>
+                  </w:pPr>
+                  <w:r>
+                    <w:rPr>
+                      <w:rFonts w:ascii="Trade Gothic Next" w:hAnsi="Trade Gothic Next"/>
+                      <w:b w:val="0"/>
+                      <w:color w:val="55604F"/>
+                      <w:sz w:val="14"/>
+                      <w:u w:val="none"/>
+                    </w:rPr>
+                    <w:t>Row 7</w:t>
+                  </w:r>
+                  <w:r>
+                    <w:rPr>
+                      <w:rFonts w:ascii="Trade Gothic Next" w:hAnsi="Trade Gothic Next"/>
+                      <w:b/>
+                      <w:color w:val="14161B"/>
+                      <w:sz w:val="16"/>
+                      <w:u w:val="none"/>
+                    </w:rPr>
+                    <w:tab/>
+                    <w:t>7s  5f  6d  7p</w:t>
+                  </w:r>
+                </w:p>
+              </w:tc>
+              <w:tc>
+                <w:tcPr>
+                  <w:tcW w:type="dxa" w:w="2592"/>
+                  <w:vAlign w:val="top"/>
+                  <w:tcMar>
+                    <w:top w:w="40" w:type="dxa"/>
+                    <w:left w:w="60" w:type="dxa"/>
+                    <w:bottom w:w="0" w:type="dxa"/>
+                    <w:right w:w="0" w:type="dxa"/>
+                  </w:tcMar>
+                </w:tcPr>
+                <w:p>
+                  <w:pPr>
+                    <w:spacing w:after="0" w:line="20" w:lineRule="exact"/>
+                  </w:pPr>
                 </w:p>
                 <w:tbl>
                   <w:tblPr>
@@ -1322,22 +1602,20 @@
                     <w:tblLayout w:type="fixed"/>
                   </w:tblPr>
                   <w:tblGrid>
-                    <w:gridCol w:w="1440"/>
                     <w:gridCol w:w="792"/>
-                    <w:gridCol w:w="792"/>
-                    <w:gridCol w:w="792"/>
+                    <w:gridCol w:w="864"/>
                     <w:gridCol w:w="792"/>
                   </w:tblGrid>
                   <w:tr>
                     <w:trPr>
                       <w:cantSplit/>
-                      <w:trHeight w:val="216" w:hRule="exact"/>
+                      <w:trHeight w:val="259" w:hRule="exact"/>
                     </w:trPr>
                     <w:tc>
                       <w:tcPr>
-                        <w:tcW w:type="dxa" w:w="1440"/>
+                        <w:tcW w:type="dxa" w:w="792"/>
                         <w:tcBorders>
-                          <w:bottom w:val="single" w:sz="8" w:color="4D730E"/>
+                          <w:bottom w:val="single" w:sz="6" w:color="C8CDC2"/>
                         </w:tcBorders>
                         <w:vAlign w:val="center"/>
                         <w:tcMar>
@@ -1350,25 +1628,15 @@
                       <w:p>
                         <w:pPr>
                           <w:spacing w:after="0"/>
-                          <w:jc w:val="left"/>
+                          <w:jc w:val="center"/>
                         </w:pPr>
-                        <w:r>
-                          <w:rPr>
-                            <w:rFonts w:ascii="Trade Gothic Next" w:hAnsi="Trade Gothic Next"/>
-                            <w:b/>
-                            <w:color w:val="4D730E"/>
-                            <w:sz w:val="14"/>
-                            <w:u w:val="none"/>
-                          </w:rPr>
-                          <w:t>SUBLEVEL</w:t>
-                        </w:r>
                       </w:p>
                     </w:tc>
                     <w:tc>
                       <w:tcPr>
-                        <w:tcW w:type="dxa" w:w="792"/>
+                        <w:tcW w:type="dxa" w:w="864"/>
                         <w:tcBorders>
-                          <w:bottom w:val="single" w:sz="8" w:color="4D730E"/>
+                          <w:bottom w:val="single" w:sz="6" w:color="C8CDC2"/>
                         </w:tcBorders>
                         <w:vAlign w:val="center"/>
                         <w:tcMar>
@@ -1387,11 +1655,11 @@
                           <w:rPr>
                             <w:rFonts w:ascii="Trade Gothic Next" w:hAnsi="Trade Gothic Next"/>
                             <w:b/>
-                            <w:color w:val="4D730E"/>
-                            <w:sz w:val="16"/>
+                            <w:color w:val="55604F"/>
+                            <w:sz w:val="13"/>
                             <w:u w:val="none"/>
                           </w:rPr>
-                          <w:t>s</w:t>
+                          <w:t>ORBITALS</w:t>
                         </w:r>
                       </w:p>
                     </w:tc>
@@ -1399,7 +1667,7 @@
                       <w:tcPr>
                         <w:tcW w:type="dxa" w:w="792"/>
                         <w:tcBorders>
-                          <w:bottom w:val="single" w:sz="8" w:color="4D730E"/>
+                          <w:bottom w:val="single" w:sz="6" w:color="C8CDC2"/>
                         </w:tcBorders>
                         <w:vAlign w:val="center"/>
                         <w:tcMar>
@@ -1418,73 +1686,22 @@
                           <w:rPr>
                             <w:rFonts w:ascii="Trade Gothic Next" w:hAnsi="Trade Gothic Next"/>
                             <w:b/>
-                            <w:color w:val="4D730E"/>
-                            <w:sz w:val="16"/>
+                            <w:color w:val="55604F"/>
+                            <w:sz w:val="13"/>
                             <w:u w:val="none"/>
                           </w:rPr>
-                          <w:t>p</w:t>
+                          <w:t>MAX e</w:t>
                         </w:r>
-                      </w:p>
-                    </w:tc>
-                    <w:tc>
-                      <w:tcPr>
-                        <w:tcW w:type="dxa" w:w="792"/>
-                        <w:tcBorders>
-                          <w:bottom w:val="single" w:sz="8" w:color="4D730E"/>
-                        </w:tcBorders>
-                        <w:vAlign w:val="center"/>
-                        <w:tcMar>
-                          <w:top w:w="0" w:type="dxa"/>
-                          <w:left w:w="10" w:type="dxa"/>
-                          <w:bottom w:w="0" w:type="dxa"/>
-                          <w:right w:w="10" w:type="dxa"/>
-                        </w:tcMar>
-                      </w:tcPr>
-                      <w:p>
-                        <w:pPr>
-                          <w:spacing w:after="0"/>
-                          <w:jc w:val="center"/>
-                        </w:pPr>
                         <w:r>
                           <w:rPr>
                             <w:rFonts w:ascii="Trade Gothic Next" w:hAnsi="Trade Gothic Next"/>
                             <w:b/>
-                            <w:color w:val="4D730E"/>
-                            <w:sz w:val="16"/>
+                            <w:color w:val="55604F"/>
+                            <w:sz w:val="13"/>
                             <w:u w:val="none"/>
+                            <w:vertAlign w:val="superscript"/>
                           </w:rPr>
-                          <w:t>d</w:t>
-                        </w:r>
-                      </w:p>
-                    </w:tc>
-                    <w:tc>
-                      <w:tcPr>
-                        <w:tcW w:type="dxa" w:w="792"/>
-                        <w:tcBorders>
-                          <w:bottom w:val="single" w:sz="8" w:color="4D730E"/>
-                        </w:tcBorders>
-                        <w:vAlign w:val="center"/>
-                        <w:tcMar>
-                          <w:top w:w="0" w:type="dxa"/>
-                          <w:left w:w="10" w:type="dxa"/>
-                          <w:bottom w:w="0" w:type="dxa"/>
-                          <w:right w:w="10" w:type="dxa"/>
-                        </w:tcMar>
-                      </w:tcPr>
-                      <w:p>
-                        <w:pPr>
-                          <w:spacing w:after="0"/>
-                          <w:jc w:val="center"/>
-                        </w:pPr>
-                        <w:r>
-                          <w:rPr>
-                            <w:rFonts w:ascii="Trade Gothic Next" w:hAnsi="Trade Gothic Next"/>
-                            <w:b/>
-                            <w:color w:val="4D730E"/>
-                            <w:sz w:val="16"/>
-                            <w:u w:val="none"/>
-                          </w:rPr>
-                          <w:t>f</w:t>
+                          <w:t>−</w:t>
                         </w:r>
                       </w:p>
                     </w:tc>
@@ -1492,36 +1709,8 @@
                   <w:tr>
                     <w:trPr>
                       <w:cantSplit/>
-                      <w:trHeight w:val="216" w:hRule="exact"/>
+                      <w:trHeight w:val="259" w:hRule="exact"/>
                     </w:trPr>
-                    <w:tc>
-                      <w:tcPr>
-                        <w:tcW w:type="dxa" w:w="1440"/>
-                        <w:vAlign w:val="center"/>
-                        <w:tcMar>
-                          <w:top w:w="0" w:type="dxa"/>
-                          <w:left w:w="10" w:type="dxa"/>
-                          <w:bottom w:w="0" w:type="dxa"/>
-                          <w:right w:w="10" w:type="dxa"/>
-                        </w:tcMar>
-                      </w:tcPr>
-                      <w:p>
-                        <w:pPr>
-                          <w:spacing w:after="0"/>
-                          <w:jc w:val="left"/>
-                        </w:pPr>
-                        <w:r>
-                          <w:rPr>
-                            <w:rFonts w:ascii="Trade Gothic Next" w:hAnsi="Trade Gothic Next"/>
-                            <w:b/>
-                            <w:color w:val="14161B"/>
-                            <w:sz w:val="14"/>
-                            <w:u w:val="none"/>
-                          </w:rPr>
-                          <w:t>Orbitals</w:t>
-                        </w:r>
-                      </w:p>
-                    </w:tc>
                     <w:tc>
                       <w:tcPr>
                         <w:tcW w:type="dxa" w:w="792"/>
@@ -1541,9 +1730,37 @@
                         <w:r>
                           <w:rPr>
                             <w:rFonts w:ascii="Trade Gothic Next" w:hAnsi="Trade Gothic Next"/>
+                            <w:b/>
+                            <w:color w:val="4D730E"/>
+                            <w:sz w:val="17"/>
+                            <w:u w:val="none"/>
+                          </w:rPr>
+                          <w:t>s</w:t>
+                        </w:r>
+                      </w:p>
+                    </w:tc>
+                    <w:tc>
+                      <w:tcPr>
+                        <w:tcW w:type="dxa" w:w="864"/>
+                        <w:vAlign w:val="center"/>
+                        <w:tcMar>
+                          <w:top w:w="0" w:type="dxa"/>
+                          <w:left w:w="10" w:type="dxa"/>
+                          <w:bottom w:w="0" w:type="dxa"/>
+                          <w:right w:w="10" w:type="dxa"/>
+                        </w:tcMar>
+                      </w:tcPr>
+                      <w:p>
+                        <w:pPr>
+                          <w:spacing w:after="0"/>
+                          <w:jc w:val="center"/>
+                        </w:pPr>
+                        <w:r>
+                          <w:rPr>
+                            <w:rFonts w:ascii="Trade Gothic Next" w:hAnsi="Trade Gothic Next"/>
                             <w:b w:val="0"/>
                             <w:color w:val="14161B"/>
-                            <w:sz w:val="16"/>
+                            <w:sz w:val="17"/>
                             <w:u w:val="none"/>
                           </w:rPr>
                           <w:t>1</w:t>
@@ -1571,7 +1788,69 @@
                             <w:rFonts w:ascii="Trade Gothic Next" w:hAnsi="Trade Gothic Next"/>
                             <w:b w:val="0"/>
                             <w:color w:val="14161B"/>
-                            <w:sz w:val="16"/>
+                            <w:sz w:val="17"/>
+                            <w:u w:val="none"/>
+                          </w:rPr>
+                          <w:t>2</w:t>
+                        </w:r>
+                      </w:p>
+                    </w:tc>
+                  </w:tr>
+                  <w:tr>
+                    <w:trPr>
+                      <w:cantSplit/>
+                      <w:trHeight w:val="259" w:hRule="exact"/>
+                    </w:trPr>
+                    <w:tc>
+                      <w:tcPr>
+                        <w:tcW w:type="dxa" w:w="792"/>
+                        <w:vAlign w:val="center"/>
+                        <w:tcMar>
+                          <w:top w:w="0" w:type="dxa"/>
+                          <w:left w:w="10" w:type="dxa"/>
+                          <w:bottom w:w="0" w:type="dxa"/>
+                          <w:right w:w="10" w:type="dxa"/>
+                        </w:tcMar>
+                      </w:tcPr>
+                      <w:p>
+                        <w:pPr>
+                          <w:spacing w:after="0"/>
+                          <w:jc w:val="center"/>
+                        </w:pPr>
+                        <w:r>
+                          <w:rPr>
+                            <w:rFonts w:ascii="Trade Gothic Next" w:hAnsi="Trade Gothic Next"/>
+                            <w:b/>
+                            <w:color w:val="4D730E"/>
+                            <w:sz w:val="17"/>
+                            <w:u w:val="none"/>
+                          </w:rPr>
+                          <w:t>p</w:t>
+                        </w:r>
+                      </w:p>
+                    </w:tc>
+                    <w:tc>
+                      <w:tcPr>
+                        <w:tcW w:type="dxa" w:w="864"/>
+                        <w:vAlign w:val="center"/>
+                        <w:tcMar>
+                          <w:top w:w="0" w:type="dxa"/>
+                          <w:left w:w="10" w:type="dxa"/>
+                          <w:bottom w:w="0" w:type="dxa"/>
+                          <w:right w:w="10" w:type="dxa"/>
+                        </w:tcMar>
+                      </w:tcPr>
+                      <w:p>
+                        <w:pPr>
+                          <w:spacing w:after="0"/>
+                          <w:jc w:val="center"/>
+                        </w:pPr>
+                        <w:r>
+                          <w:rPr>
+                            <w:rFonts w:ascii="Trade Gothic Next" w:hAnsi="Trade Gothic Next"/>
+                            <w:b w:val="0"/>
+                            <w:color w:val="14161B"/>
+                            <w:sz w:val="17"/>
                             <w:u w:val="none"/>
                           </w:rPr>
                           <w:t>3</w:t>
@@ -1599,7 +1878,69 @@
                             <w:rFonts w:ascii="Trade Gothic Next" w:hAnsi="Trade Gothic Next"/>
                             <w:b w:val="0"/>
                             <w:color w:val="14161B"/>
-                            <w:sz w:val="16"/>
+                            <w:sz w:val="17"/>
+                            <w:u w:val="none"/>
+                          </w:rPr>
+                          <w:t>6</w:t>
+                        </w:r>
+                      </w:p>
+                    </w:tc>
+                  </w:tr>
+                  <w:tr>
+                    <w:trPr>
+                      <w:cantSplit/>
+                      <w:trHeight w:val="259" w:hRule="exact"/>
+                    </w:trPr>
+                    <w:tc>
+                      <w:tcPr>
+                        <w:tcW w:type="dxa" w:w="792"/>
+                        <w:vAlign w:val="center"/>
+                        <w:tcMar>
+                          <w:top w:w="0" w:type="dxa"/>
+                          <w:left w:w="10" w:type="dxa"/>
+                          <w:bottom w:w="0" w:type="dxa"/>
+                          <w:right w:w="10" w:type="dxa"/>
+                        </w:tcMar>
+                      </w:tcPr>
+                      <w:p>
+                        <w:pPr>
+                          <w:spacing w:after="0"/>
+                          <w:jc w:val="center"/>
+                        </w:pPr>
+                        <w:r>
+                          <w:rPr>
+                            <w:rFonts w:ascii="Trade Gothic Next" w:hAnsi="Trade Gothic Next"/>
+                            <w:b/>
+                            <w:color w:val="4D730E"/>
+                            <w:sz w:val="17"/>
+                            <w:u w:val="none"/>
+                          </w:rPr>
+                          <w:t>d</w:t>
+                        </w:r>
+                      </w:p>
+                    </w:tc>
+                    <w:tc>
+                      <w:tcPr>
+                        <w:tcW w:type="dxa" w:w="864"/>
+                        <w:vAlign w:val="center"/>
+                        <w:tcMar>
+                          <w:top w:w="0" w:type="dxa"/>
+                          <w:left w:w="10" w:type="dxa"/>
+                          <w:bottom w:w="0" w:type="dxa"/>
+                          <w:right w:w="10" w:type="dxa"/>
+                        </w:tcMar>
+                      </w:tcPr>
+                      <w:p>
+                        <w:pPr>
+                          <w:spacing w:after="0"/>
+                          <w:jc w:val="center"/>
+                        </w:pPr>
+                        <w:r>
+                          <w:rPr>
+                            <w:rFonts w:ascii="Trade Gothic Next" w:hAnsi="Trade Gothic Next"/>
+                            <w:b w:val="0"/>
+                            <w:color w:val="14161B"/>
+                            <w:sz w:val="17"/>
                             <w:u w:val="none"/>
                           </w:rPr>
                           <w:t>5</w:t>
@@ -1627,10 +1968,10 @@
                             <w:rFonts w:ascii="Trade Gothic Next" w:hAnsi="Trade Gothic Next"/>
                             <w:b w:val="0"/>
                             <w:color w:val="14161B"/>
-                            <w:sz w:val="16"/>
+                            <w:sz w:val="17"/>
                             <w:u w:val="none"/>
                           </w:rPr>
-                          <w:t>7</w:t>
+                          <w:t>10</w:t>
                         </w:r>
                       </w:p>
                     </w:tc>
@@ -1638,11 +1979,11 @@
                   <w:tr>
                     <w:trPr>
                       <w:cantSplit/>
-                      <w:trHeight w:val="216" w:hRule="exact"/>
+                      <w:trHeight w:val="259" w:hRule="exact"/>
                     </w:trPr>
                     <w:tc>
                       <w:tcPr>
-                        <w:tcW w:type="dxa" w:w="1440"/>
+                        <w:tcW w:type="dxa" w:w="792"/>
                         <w:vAlign w:val="center"/>
                         <w:tcMar>
                           <w:top w:w="0" w:type="dxa"/>
@@ -1654,28 +1995,45 @@
                       <w:p>
                         <w:pPr>
                           <w:spacing w:after="0"/>
-                          <w:jc w:val="left"/>
+                          <w:jc w:val="center"/>
                         </w:pPr>
                         <w:r>
                           <w:rPr>
                             <w:rFonts w:ascii="Trade Gothic Next" w:hAnsi="Trade Gothic Next"/>
                             <w:b/>
-                            <w:color w:val="14161B"/>
-                            <w:sz w:val="14"/>
+                            <w:color w:val="4D730E"/>
+                            <w:sz w:val="17"/>
                             <w:u w:val="none"/>
                           </w:rPr>
-                          <w:t>Max e</w:t>
+                          <w:t>f</w:t>
                         </w:r>
+                      </w:p>
+                    </w:tc>
+                    <w:tc>
+                      <w:tcPr>
+                        <w:tcW w:type="dxa" w:w="864"/>
+                        <w:vAlign w:val="center"/>
+                        <w:tcMar>
+                          <w:top w:w="0" w:type="dxa"/>
+                          <w:left w:w="10" w:type="dxa"/>
+                          <w:bottom w:w="0" w:type="dxa"/>
+                          <w:right w:w="10" w:type="dxa"/>
+                        </w:tcMar>
+                      </w:tcPr>
+                      <w:p>
+                        <w:pPr>
+                          <w:spacing w:after="0"/>
+                          <w:jc w:val="center"/>
+                        </w:pPr>
                         <w:r>
                           <w:rPr>
                             <w:rFonts w:ascii="Trade Gothic Next" w:hAnsi="Trade Gothic Next"/>
-                            <w:b/>
+                            <w:b w:val="0"/>
                             <w:color w:val="14161B"/>
-                            <w:sz w:val="14"/>
+                            <w:sz w:val="17"/>
                             <w:u w:val="none"/>
-                            <w:vertAlign w:val="superscript"/>
                           </w:rPr>
-                          <w:t>−</w:t>
+                          <w:t>7</w:t>
                         </w:r>
                       </w:p>
                     </w:tc>
@@ -1700,91 +2058,7 @@
                             <w:rFonts w:ascii="Trade Gothic Next" w:hAnsi="Trade Gothic Next"/>
                             <w:b w:val="0"/>
                             <w:color w:val="14161B"/>
-                            <w:sz w:val="16"/>
-                            <w:u w:val="none"/>
-                          </w:rPr>
-                          <w:t>2</w:t>
-                        </w:r>
-                      </w:p>
-                    </w:tc>
-                    <w:tc>
-                      <w:tcPr>
-                        <w:tcW w:type="dxa" w:w="792"/>
-                        <w:vAlign w:val="center"/>
-                        <w:tcMar>
-                          <w:top w:w="0" w:type="dxa"/>
-                          <w:left w:w="10" w:type="dxa"/>
-                          <w:bottom w:w="0" w:type="dxa"/>
-                          <w:right w:w="10" w:type="dxa"/>
-                        </w:tcMar>
-                      </w:tcPr>
-                      <w:p>
-                        <w:pPr>
-                          <w:spacing w:after="0"/>
-                          <w:jc w:val="center"/>
-                        </w:pPr>
-                        <w:r>
-                          <w:rPr>
-                            <w:rFonts w:ascii="Trade Gothic Next" w:hAnsi="Trade Gothic Next"/>
-                            <w:b w:val="0"/>
-                            <w:color w:val="14161B"/>
-                            <w:sz w:val="16"/>
-                            <w:u w:val="none"/>
-                          </w:rPr>
-                          <w:t>6</w:t>
-                        </w:r>
-                      </w:p>
-                    </w:tc>
-                    <w:tc>
-                      <w:tcPr>
-                        <w:tcW w:type="dxa" w:w="792"/>
-                        <w:vAlign w:val="center"/>
-                        <w:tcMar>
-                          <w:top w:w="0" w:type="dxa"/>
-                          <w:left w:w="10" w:type="dxa"/>
-                          <w:bottom w:w="0" w:type="dxa"/>
-                          <w:right w:w="10" w:type="dxa"/>
-                        </w:tcMar>
-                      </w:tcPr>
-                      <w:p>
-                        <w:pPr>
-                          <w:spacing w:after="0"/>
-                          <w:jc w:val="center"/>
-                        </w:pPr>
-                        <w:r>
-                          <w:rPr>
-                            <w:rFonts w:ascii="Trade Gothic Next" w:hAnsi="Trade Gothic Next"/>
-                            <w:b w:val="0"/>
-                            <w:color w:val="14161B"/>
-                            <w:sz w:val="16"/>
-                            <w:u w:val="none"/>
-                          </w:rPr>
-                          <w:t>10</w:t>
-                        </w:r>
-                      </w:p>
-                    </w:tc>
-                    <w:tc>
-                      <w:tcPr>
-                        <w:tcW w:type="dxa" w:w="792"/>
-                        <w:vAlign w:val="center"/>
-                        <w:tcMar>
-                          <w:top w:w="0" w:type="dxa"/>
-                          <w:left w:w="10" w:type="dxa"/>
-                          <w:bottom w:w="0" w:type="dxa"/>
-                          <w:right w:w="10" w:type="dxa"/>
-                        </w:tcMar>
-                      </w:tcPr>
-                      <w:p>
-                        <w:pPr>
-                          <w:spacing w:after="0"/>
-                          <w:jc w:val="center"/>
-                        </w:pPr>
-                        <w:r>
-                          <w:rPr>
-                            <w:rFonts w:ascii="Trade Gothic Next" w:hAnsi="Trade Gothic Next"/>
-                            <w:b w:val="0"/>
-                            <w:color w:val="14161B"/>
-                            <w:sz w:val="16"/>
+                            <w:sz w:val="17"/>
                             <w:u w:val="none"/>
                           </w:rPr>
                           <w:t>14</w:t>
@@ -3147,10 +3421,10 @@
           <w:tcPr>
             <w:tcW w:type="dxa" w:w="684"/>
             <w:tcBorders>
-              <w:top w:val="single" w:sz="16" w:color="4D730E"/>
-              <w:left w:val="single" w:sz="16" w:color="4D730E"/>
-              <w:bottom w:val="single" w:sz="16" w:color="4D730E"/>
-              <w:right w:val="single" w:sz="16" w:color="4D730E"/>
+              <w:top w:val="single" w:sz="6" w:color="14161B"/>
+              <w:left w:val="single" w:sz="6" w:color="14161B"/>
+              <w:bottom w:val="single" w:sz="6" w:color="14161B"/>
+              <w:right w:val="single" w:sz="6" w:color="14161B"/>
             </w:tcBorders>
             <w:vAlign w:val="top"/>
             <w:tcMar>
@@ -3173,16 +3447,6 @@
                 <w:u w:val="none"/>
               </w:rPr>
               <w:t>24</w:t>
-            </w:r>
-            <w:r>
-              <w:rPr>
-                <w:rFonts w:ascii="Trade Gothic Next" w:hAnsi="Trade Gothic Next"/>
-                <w:b/>
-                <w:color w:val="4D730E"/>
-                <w:sz w:val="15"/>
-                <w:u w:val="none"/>
-              </w:rPr>
-              <w:t xml:space="preserve">  *</w:t>
             </w:r>
           </w:p>
           <w:p>
@@ -3402,10 +3666,10 @@
           <w:tcPr>
             <w:tcW w:type="dxa" w:w="684"/>
             <w:tcBorders>
-              <w:top w:val="single" w:sz="16" w:color="4D730E"/>
-              <w:left w:val="single" w:sz="16" w:color="4D730E"/>
-              <w:bottom w:val="single" w:sz="16" w:color="4D730E"/>
-              <w:right w:val="single" w:sz="16" w:color="4D730E"/>
+              <w:top w:val="single" w:sz="6" w:color="14161B"/>
+              <w:left w:val="single" w:sz="6" w:color="14161B"/>
+              <w:bottom w:val="single" w:sz="6" w:color="14161B"/>
+              <w:right w:val="single" w:sz="6" w:color="14161B"/>
             </w:tcBorders>
             <w:vAlign w:val="top"/>
             <w:tcMar>
@@ -3428,16 +3692,6 @@
                 <w:u w:val="none"/>
               </w:rPr>
               <w:t>29</w:t>
-            </w:r>
-            <w:r>
-              <w:rPr>
-                <w:rFonts w:ascii="Trade Gothic Next" w:hAnsi="Trade Gothic Next"/>
-                <w:b/>
-                <w:color w:val="4D730E"/>
-                <w:sz w:val="15"/>
-                <w:u w:val="none"/>
-              </w:rPr>
-              <w:t xml:space="preserve">  *</w:t>
             </w:r>
           </w:p>
           <w:p>
@@ -6867,10 +7121,7 @@
         <w:tblLayout w:type="fixed"/>
       </w:tblPr>
       <w:tblGrid>
-        <w:gridCol w:w="432"/>
-        <w:gridCol w:w="684"/>
-        <w:gridCol w:w="684"/>
-        <w:gridCol w:w="634"/>
+        <w:gridCol w:w="2434"/>
         <w:gridCol w:w="432"/>
         <w:gridCol w:w="684"/>
         <w:gridCol w:w="684"/>
@@ -6882,9 +7133,6 @@
         <w:gridCol w:w="684"/>
         <w:gridCol w:w="684"/>
         <w:gridCol w:w="684"/>
-        <w:gridCol w:w="432"/>
-        <w:gridCol w:w="684"/>
-        <w:gridCol w:w="684"/>
         <w:gridCol w:w="684"/>
         <w:gridCol w:w="684"/>
         <w:gridCol w:w="684"/>
@@ -6893,12 +7141,61 @@
       <w:tr>
         <w:trPr>
           <w:cantSplit/>
+          <w:trHeight w:val="288" w:hRule="exact"/>
+        </w:trPr>
+        <w:tc>
+          <w:tcPr>
+            <w:tcW w:type="dxa" w:w="2434"/>
+          </w:tcPr>
+          <w:p/>
+        </w:tc>
+        <w:tc>
+          <w:tcPr>
+            <w:tcW w:type="dxa" w:w="432"/>
+          </w:tcPr>
+          <w:p/>
+        </w:tc>
+        <w:tc>
+          <w:tcPr>
+            <w:tcW w:type="dxa" w:w="9576"/>
+            <w:gridSpan w:val="14"/>
+            <w:tcBorders>
+              <w:bottom w:val="single" w:sz="14" w:color="4D730E"/>
+            </w:tcBorders>
+            <w:vAlign w:val="center"/>
+            <w:tcMar>
+              <w:top w:w="0" w:type="dxa"/>
+              <w:left w:w="10" w:type="dxa"/>
+              <w:bottom w:w="0" w:type="dxa"/>
+              <w:right w:w="10" w:type="dxa"/>
+            </w:tcMar>
+          </w:tcPr>
+          <w:p>
+            <w:pPr>
+              <w:spacing w:after="0"/>
+              <w:jc w:val="center"/>
+            </w:pPr>
+            <w:r>
+              <w:rPr>
+                <w:rFonts w:ascii="Trade Gothic Next" w:hAnsi="Trade Gothic Next"/>
+                <w:b/>
+                <w:color w:val="4D730E"/>
+                <w:sz w:val="14"/>
+                <w:u w:val="none"/>
+              </w:rPr>
+              <w:t>f-BLOCK  ·  fits between groups 2 and 3 in rows 6 and 7</w:t>
+            </w:r>
+          </w:p>
+        </w:tc>
+      </w:tr>
+      <w:tr>
+        <w:trPr>
+          <w:cantSplit/>
           <w:trHeight w:val="806" w:hRule="exact"/>
         </w:trPr>
         <w:tc>
           <w:tcPr>
             <w:tcW w:type="dxa" w:w="2434"/>
-            <w:gridSpan w:val="4"/>
             <w:vAlign w:val="center"/>
             <w:tcMar>
               <w:top w:w="0" w:type="dxa"/>
@@ -7444,12 +7741,6 @@
         </w:tc>
         <w:tc>
           <w:tcPr>
-            <w:tcW w:type="dxa" w:w="432"/>
-          </w:tcPr>
-          <w:p/>
-        </w:tc>
-        <w:tc>
-          <w:tcPr>
             <w:tcW w:type="dxa" w:w="684"/>
             <w:tcBorders>
               <w:top w:val="single" w:sz="6" w:color="14161B"/>
@@ -7644,18 +7935,6 @@
             </w:r>
           </w:p>
         </w:tc>
-        <w:tc>
-          <w:tcPr>
-            <w:tcW w:type="dxa" w:w="684"/>
-          </w:tcPr>
-          <w:p/>
-        </w:tc>
-        <w:tc>
-          <w:tcPr>
-            <w:tcW w:type="dxa" w:w="684"/>
-          </w:tcPr>
-          <w:p/>
-        </w:tc>
       </w:tr>
       <w:tr>
         <w:trPr>
@@ -7665,7 +7944,6 @@
         <w:tc>
           <w:tcPr>
             <w:tcW w:type="dxa" w:w="2434"/>
-            <w:gridSpan w:val="4"/>
             <w:vAlign w:val="center"/>
             <w:tcMar>
               <w:top w:w="0" w:type="dxa"/>
@@ -8211,12 +8489,6 @@
         </w:tc>
         <w:tc>
           <w:tcPr>
-            <w:tcW w:type="dxa" w:w="432"/>
-          </w:tcPr>
-          <w:p/>
-        </w:tc>
-        <w:tc>
-          <w:tcPr>
             <w:tcW w:type="dxa" w:w="684"/>
             <w:tcBorders>
               <w:top w:val="single" w:sz="6" w:color="14161B"/>
@@ -8411,18 +8683,6 @@
             </w:r>
           </w:p>
         </w:tc>
-        <w:tc>
-          <w:tcPr>
-            <w:tcW w:type="dxa" w:w="684"/>
-          </w:tcPr>
-          <w:p/>
-        </w:tc>
-        <w:tc>
-          <w:tcPr>
-            <w:tcW w:type="dxa" w:w="684"/>
-          </w:tcPr>
-          <w:p/>
-        </w:tc>
       </w:tr>
     </w:tbl>
     <w:p>
@@ -8444,269 +8704,13 @@
         <w:tblLayout w:type="fixed"/>
       </w:tblPr>
       <w:tblGrid>
-        <w:gridCol w:w="5184"/>
-        <w:gridCol w:w="4464"/>
-        <w:gridCol w:w="4594"/>
+        <w:gridCol w:w="7121"/>
+        <w:gridCol w:w="7121"/>
       </w:tblGrid>
       <w:tr>
         <w:tc>
           <w:tcPr>
-            <w:tcW w:type="dxa" w:w="5184"/>
-            <w:vAlign w:val="top"/>
-            <w:tcBorders>
-              <w:top w:val="single" w:sz="8" w:color="4D730E"/>
-            </w:tcBorders>
-            <w:tcMar>
-              <w:top w:w="40" w:type="dxa"/>
-              <w:left w:w="40" w:type="dxa"/>
-              <w:bottom w:w="0" w:type="dxa"/>
-              <w:right w:w="120" w:type="dxa"/>
-            </w:tcMar>
-          </w:tcPr>
-          <w:p>
-            <w:pPr>
-              <w:spacing w:after="40"/>
-            </w:pPr>
-            <w:r>
-              <w:rPr>
-                <w:rFonts w:ascii="Trade Gothic Next" w:hAnsi="Trade Gothic Next"/>
-                <w:b/>
-                <w:color w:val="4D730E"/>
-                <w:sz w:val="13"/>
-                <w:u w:val="none"/>
-              </w:rPr>
-              <w:t>* ELECTRON STABILITY EXCEPTIONS</w:t>
-            </w:r>
-          </w:p>
-          <w:p>
-            <w:pPr>
-              <w:spacing w:after="0"/>
-            </w:pPr>
-            <w:r>
-              <w:rPr>
-                <w:rFonts w:ascii="Trade Gothic Next" w:hAnsi="Trade Gothic Next"/>
-                <w:b w:val="0"/>
-                <w:color w:val="14161B"/>
-                <w:sz w:val="16"/>
-                <w:u w:val="none"/>
-              </w:rPr>
-              <w:t>Cr is [Ar] 4s</w:t>
-            </w:r>
-            <w:r>
-              <w:rPr>
-                <w:rFonts w:ascii="Trade Gothic Next" w:hAnsi="Trade Gothic Next"/>
-                <w:b w:val="0"/>
-                <w:color w:val="14161B"/>
-                <w:sz w:val="16"/>
-                <w:u w:val="none"/>
-                <w:vertAlign w:val="superscript"/>
-              </w:rPr>
-              <w:t>1</w:t>
-            </w:r>
-            <w:r>
-              <w:rPr>
-                <w:rFonts w:ascii="Trade Gothic Next" w:hAnsi="Trade Gothic Next"/>
-                <w:b w:val="0"/>
-                <w:color w:val="14161B"/>
-                <w:sz w:val="16"/>
-                <w:u w:val="none"/>
-              </w:rPr>
-              <w:t xml:space="preserve"> 3d</w:t>
-            </w:r>
-            <w:r>
-              <w:rPr>
-                <w:rFonts w:ascii="Trade Gothic Next" w:hAnsi="Trade Gothic Next"/>
-                <w:b w:val="0"/>
-                <w:color w:val="14161B"/>
-                <w:sz w:val="16"/>
-                <w:u w:val="none"/>
-                <w:vertAlign w:val="superscript"/>
-              </w:rPr>
-              <w:t>5</w:t>
-            </w:r>
-            <w:r>
-              <w:rPr>
-                <w:rFonts w:ascii="Trade Gothic Next" w:hAnsi="Trade Gothic Next"/>
-                <w:b w:val="0"/>
-                <w:color w:val="14161B"/>
-                <w:sz w:val="16"/>
-                <w:u w:val="none"/>
-              </w:rPr>
-              <w:t>, not 4s</w:t>
-            </w:r>
-            <w:r>
-              <w:rPr>
-                <w:rFonts w:ascii="Trade Gothic Next" w:hAnsi="Trade Gothic Next"/>
-                <w:b w:val="0"/>
-                <w:color w:val="14161B"/>
-                <w:sz w:val="16"/>
-                <w:u w:val="none"/>
-                <w:vertAlign w:val="superscript"/>
-              </w:rPr>
-              <w:t>2</w:t>
-            </w:r>
-            <w:r>
-              <w:rPr>
-                <w:rFonts w:ascii="Trade Gothic Next" w:hAnsi="Trade Gothic Next"/>
-                <w:b w:val="0"/>
-                <w:color w:val="14161B"/>
-                <w:sz w:val="16"/>
-                <w:u w:val="none"/>
-              </w:rPr>
-              <w:t xml:space="preserve"> 3d</w:t>
-            </w:r>
-            <w:r>
-              <w:rPr>
-                <w:rFonts w:ascii="Trade Gothic Next" w:hAnsi="Trade Gothic Next"/>
-                <w:b w:val="0"/>
-                <w:color w:val="14161B"/>
-                <w:sz w:val="16"/>
-                <w:u w:val="none"/>
-                <w:vertAlign w:val="superscript"/>
-              </w:rPr>
-              <w:t>4</w:t>
-            </w:r>
-            <w:r>
-              <w:rPr>
-                <w:rFonts w:ascii="Trade Gothic Next" w:hAnsi="Trade Gothic Next"/>
-                <w:b w:val="0"/>
-                <w:color w:val="14161B"/>
-                <w:sz w:val="16"/>
-                <w:u w:val="none"/>
-              </w:rPr>
-              <w:t>. Cu is [Ar] 4s</w:t>
-            </w:r>
-            <w:r>
-              <w:rPr>
-                <w:rFonts w:ascii="Trade Gothic Next" w:hAnsi="Trade Gothic Next"/>
-                <w:b w:val="0"/>
-                <w:color w:val="14161B"/>
-                <w:sz w:val="16"/>
-                <w:u w:val="none"/>
-                <w:vertAlign w:val="superscript"/>
-              </w:rPr>
-              <w:t>1</w:t>
-            </w:r>
-            <w:r>
-              <w:rPr>
-                <w:rFonts w:ascii="Trade Gothic Next" w:hAnsi="Trade Gothic Next"/>
-                <w:b w:val="0"/>
-                <w:color w:val="14161B"/>
-                <w:sz w:val="16"/>
-                <w:u w:val="none"/>
-              </w:rPr>
-              <w:t xml:space="preserve"> 3d</w:t>
-            </w:r>
-            <w:r>
-              <w:rPr>
-                <w:rFonts w:ascii="Trade Gothic Next" w:hAnsi="Trade Gothic Next"/>
-                <w:b w:val="0"/>
-                <w:color w:val="14161B"/>
-                <w:sz w:val="16"/>
-                <w:u w:val="none"/>
-                <w:vertAlign w:val="superscript"/>
-              </w:rPr>
-              <w:t>10</w:t>
-            </w:r>
-            <w:r>
-              <w:rPr>
-                <w:rFonts w:ascii="Trade Gothic Next" w:hAnsi="Trade Gothic Next"/>
-                <w:b w:val="0"/>
-                <w:color w:val="14161B"/>
-                <w:sz w:val="16"/>
-                <w:u w:val="none"/>
-              </w:rPr>
-              <w:t>, not 4s</w:t>
-            </w:r>
-            <w:r>
-              <w:rPr>
-                <w:rFonts w:ascii="Trade Gothic Next" w:hAnsi="Trade Gothic Next"/>
-                <w:b w:val="0"/>
-                <w:color w:val="14161B"/>
-                <w:sz w:val="16"/>
-                <w:u w:val="none"/>
-                <w:vertAlign w:val="superscript"/>
-              </w:rPr>
-              <w:t>2</w:t>
-            </w:r>
-            <w:r>
-              <w:rPr>
-                <w:rFonts w:ascii="Trade Gothic Next" w:hAnsi="Trade Gothic Next"/>
-                <w:b w:val="0"/>
-                <w:color w:val="14161B"/>
-                <w:sz w:val="16"/>
-                <w:u w:val="none"/>
-              </w:rPr>
-              <w:t xml:space="preserve"> 3d</w:t>
-            </w:r>
-            <w:r>
-              <w:rPr>
-                <w:rFonts w:ascii="Trade Gothic Next" w:hAnsi="Trade Gothic Next"/>
-                <w:b w:val="0"/>
-                <w:color w:val="14161B"/>
-                <w:sz w:val="16"/>
-                <w:u w:val="none"/>
-                <w:vertAlign w:val="superscript"/>
-              </w:rPr>
-              <w:t>9</w:t>
-            </w:r>
-            <w:r>
-              <w:rPr>
-                <w:rFonts w:ascii="Trade Gothic Next" w:hAnsi="Trade Gothic Next"/>
-                <w:b w:val="0"/>
-                <w:color w:val="14161B"/>
-                <w:sz w:val="16"/>
-                <w:u w:val="none"/>
-              </w:rPr>
-              <w:t>. One 4s electron moves into 3d because a half-full (d</w:t>
-            </w:r>
-            <w:r>
-              <w:rPr>
-                <w:rFonts w:ascii="Trade Gothic Next" w:hAnsi="Trade Gothic Next"/>
-                <w:b w:val="0"/>
-                <w:color w:val="14161B"/>
-                <w:sz w:val="16"/>
-                <w:u w:val="none"/>
-                <w:vertAlign w:val="superscript"/>
-              </w:rPr>
-              <w:t>5</w:t>
-            </w:r>
-            <w:r>
-              <w:rPr>
-                <w:rFonts w:ascii="Trade Gothic Next" w:hAnsi="Trade Gothic Next"/>
-                <w:b w:val="0"/>
-                <w:color w:val="14161B"/>
-                <w:sz w:val="16"/>
-                <w:u w:val="none"/>
-              </w:rPr>
-              <w:t>) or full (d</w:t>
-            </w:r>
-            <w:r>
-              <w:rPr>
-                <w:rFonts w:ascii="Trade Gothic Next" w:hAnsi="Trade Gothic Next"/>
-                <w:b w:val="0"/>
-                <w:color w:val="14161B"/>
-                <w:sz w:val="16"/>
-                <w:u w:val="none"/>
-                <w:vertAlign w:val="superscript"/>
-              </w:rPr>
-              <w:t>10</w:t>
-            </w:r>
-            <w:r>
-              <w:rPr>
-                <w:rFonts w:ascii="Trade Gothic Next" w:hAnsi="Trade Gothic Next"/>
-                <w:b w:val="0"/>
-                <w:color w:val="14161B"/>
-                <w:sz w:val="16"/>
-                <w:u w:val="none"/>
-              </w:rPr>
-              <w:t>) d sublevel has lower energy.</w:t>
-            </w:r>
-          </w:p>
-        </w:tc>
-        <w:tc>
-          <w:tcPr>
-            <w:tcW w:type="dxa" w:w="4464"/>
+            <w:tcW w:type="dxa" w:w="7121"/>
             <w:vAlign w:val="top"/>
             <w:tcBorders>
               <w:top w:val="single" w:sz="8" w:color="C8CDC2"/>
@@ -8751,7 +8755,7 @@
         </w:tc>
         <w:tc>
           <w:tcPr>
-            <w:tcW w:type="dxa" w:w="4594"/>
+            <w:tcW w:type="dxa" w:w="7121"/>
             <w:vAlign w:val="top"/>
             <w:tcBorders>
               <w:top w:val="single" w:sz="8" w:color="C8CDC2"/>

</xml_diff>

<commit_message>
Unit 2 reference: overseer fixes (He valence 2, cleaner diagonal arrows, larger diagram, plainer subtitle)
Co-Authored-By: Claude Opus 5.5 <noreply@anthropic.com>
Claude-Session: https://claude.ai/code/session_01LaT1EarAMnh5opQoFahNzN
</commit_message>
<xml_diff>
--- a/output/chem-u02/Unit 2 Reference - Periodic Table by Sublevel.docx
+++ b/output/chem-u02/Unit 2 Reference - Periodic Table by Sublevel.docx
@@ -62,7 +62,7 @@
                 <w:sz w:val="14"/>
                 <w:spacing w:val="26"/>
               </w:rPr>
-              <w:t>UNIT 2 TEST  ·  REFERENCE  ·  YOU MAY WRITE ON THIS SHEET ONLY IF I SAY SO</w:t>
+              <w:t>UNIT 2 TEST  ·  REFERENCE  ·  DO NOT WRITE ON THIS SHEET</w:t>
             </w:r>
           </w:p>
         </w:tc>
@@ -1095,13 +1095,23 @@
               </w:rPr>
               <w:t>8</w:t>
             </w:r>
+            <w:r>
+              <w:rPr>
+                <w:rFonts w:ascii="Trade Gothic Next" w:hAnsi="Trade Gothic Next"/>
+                <w:b w:val="0"/>
+                <w:color w:val="55604F"/>
+                <w:sz w:val="13"/>
+                <w:u w:val="none"/>
+              </w:rPr>
+              <w:t xml:space="preserve">  He: 2</w:t>
+            </w:r>
           </w:p>
         </w:tc>
       </w:tr>
       <w:tr>
         <w:trPr>
           <w:cantSplit/>
-          <w:trHeight w:val="806" w:hRule="exact"/>
+          <w:trHeight w:val="907" w:hRule="exact"/>
         </w:trPr>
         <w:tc>
           <w:tcPr>
@@ -1330,7 +1340,7 @@
                   <w:r>
                     <w:drawing>
                       <wp:inline xmlns:a="http://schemas.openxmlformats.org/drawingml/2006/main" xmlns:pic="http://schemas.openxmlformats.org/drawingml/2006/picture">
-                        <wp:extent cx="891124" cy="1024128"/>
+                        <wp:extent cx="1034341" cy="1188720"/>
                         <wp:docPr id="1" name="Picture 1"/>
                         <wp:cNvGraphicFramePr>
                           <a:graphicFrameLocks noChangeAspect="1"/>
@@ -1351,7 +1361,7 @@
                               <pic:spPr>
                                 <a:xfrm>
                                   <a:off x="0" y="0"/>
-                                  <a:ext cx="891124" cy="1024128"/>
+                                  <a:ext cx="1034341" cy="1188720"/>
                                 </a:xfrm>
                                 <a:prstGeom prst="rect"/>
                               </pic:spPr>
@@ -2184,7 +2194,7 @@
       <w:tr>
         <w:trPr>
           <w:cantSplit/>
-          <w:trHeight w:val="806" w:hRule="exact"/>
+          <w:trHeight w:val="907" w:hRule="exact"/>
         </w:trPr>
         <w:tc>
           <w:tcPr>
@@ -2646,7 +2656,7 @@
       <w:tr>
         <w:trPr>
           <w:cantSplit/>
-          <w:trHeight w:val="806" w:hRule="exact"/>
+          <w:trHeight w:val="907" w:hRule="exact"/>
         </w:trPr>
         <w:tc>
           <w:tcPr>

</xml_diff>

<commit_message>
Unit 2 reference: capacity table and written filling order removed (they answered test items); diagonal diagram only
Co-Authored-By: Claude Opus 5.5 <noreply@anthropic.com>
Claude-Session: https://claude.ai/code/session_01LaT1EarAMnh5opQoFahNzN
</commit_message>
<xml_diff>
--- a/output/chem-u02/Unit 2 Reference - Periodic Table by Sublevel.docx
+++ b/output/chem-u02/Unit 2 Reference - Periodic Table by Sublevel.docx
@@ -1209,879 +1209,72 @@
               <w:right w:w="40" w:type="dxa"/>
             </w:tcMar>
           </w:tcPr>
-          <w:p/>
-          <w:tbl>
-            <w:tblPr>
-              <w:tblW w:type="auto" w:w="0"/>
-              <w:tblLayout w:type="fixed"/>
-              <w:tblLook w:firstColumn="1" w:firstRow="1" w:lastColumn="0" w:lastRow="0" w:noHBand="0" w:noVBand="1" w:val="04A0"/>
-              <w:tblLayout w:type="fixed"/>
-            </w:tblPr>
-            <w:tblGrid>
-              <w:gridCol w:w="2232"/>
-              <w:gridCol w:w="2880"/>
-              <w:gridCol w:w="2592"/>
-            </w:tblGrid>
-            <w:tr>
-              <w:trPr>
-                <w:cantSplit/>
-                <w:trHeight w:val="273" w:hRule="exact"/>
-              </w:trPr>
-              <w:tc>
-                <w:tcPr>
-                  <w:tcW w:type="dxa" w:w="2232"/>
-                  <w:tcBorders>
-                    <w:bottom w:val="single" w:sz="10" w:color="4D730E"/>
-                  </w:tcBorders>
-                  <w:vAlign w:val="center"/>
-                  <w:tcMar>
-                    <w:top w:w="0" w:type="dxa"/>
-                    <w:left w:w="10" w:type="dxa"/>
-                    <w:bottom w:w="0" w:type="dxa"/>
-                    <w:right w:w="10" w:type="dxa"/>
-                  </w:tcMar>
-                </w:tcPr>
-                <w:p>
-                  <w:pPr>
-                    <w:spacing w:after="0"/>
-                    <w:jc w:val="left"/>
-                  </w:pPr>
-                  <w:r>
-                    <w:rPr>
-                      <w:rFonts w:ascii="Trade Gothic Next" w:hAnsi="Trade Gothic Next"/>
-                      <w:b/>
-                      <w:color w:val="4D730E"/>
-                      <w:sz w:val="13"/>
-                      <w:u w:val="none"/>
-                    </w:rPr>
-                    <w:t>DIAGONAL RULE</w:t>
-                  </w:r>
-                </w:p>
-              </w:tc>
-              <w:tc>
-                <w:tcPr>
-                  <w:tcW w:type="dxa" w:w="2880"/>
-                  <w:tcBorders>
-                    <w:bottom w:val="single" w:sz="10" w:color="4D730E"/>
-                  </w:tcBorders>
-                  <w:vAlign w:val="center"/>
-                  <w:tcMar>
-                    <w:top w:w="0" w:type="dxa"/>
-                    <w:left w:w="10" w:type="dxa"/>
-                    <w:bottom w:w="0" w:type="dxa"/>
-                    <w:right w:w="10" w:type="dxa"/>
-                  </w:tcMar>
-                </w:tcPr>
-                <w:p>
-                  <w:pPr>
-                    <w:spacing w:after="0"/>
-                    <w:jc w:val="left"/>
-                  </w:pPr>
-                  <w:r>
-                    <w:rPr>
-                      <w:rFonts w:ascii="Trade Gothic Next" w:hAnsi="Trade Gothic Next"/>
-                      <w:b/>
-                      <w:color w:val="4D730E"/>
-                      <w:sz w:val="13"/>
-                      <w:u w:val="none"/>
-                    </w:rPr>
-                    <w:t>FILLING ORDER, ROW BY ROW</w:t>
-                  </w:r>
-                </w:p>
-              </w:tc>
-              <w:tc>
-                <w:tcPr>
-                  <w:tcW w:type="dxa" w:w="2592"/>
-                  <w:tcBorders>
-                    <w:bottom w:val="single" w:sz="10" w:color="4D730E"/>
-                  </w:tcBorders>
-                  <w:vAlign w:val="center"/>
-                  <w:tcMar>
-                    <w:top w:w="0" w:type="dxa"/>
-                    <w:left w:w="10" w:type="dxa"/>
-                    <w:bottom w:w="0" w:type="dxa"/>
-                    <w:right w:w="10" w:type="dxa"/>
-                  </w:tcMar>
-                </w:tcPr>
-                <w:p>
-                  <w:pPr>
-                    <w:spacing w:after="0"/>
-                    <w:jc w:val="left"/>
-                  </w:pPr>
-                  <w:r>
-                    <w:rPr>
-                      <w:rFonts w:ascii="Trade Gothic Next" w:hAnsi="Trade Gothic Next"/>
-                      <w:b/>
-                      <w:color w:val="4D730E"/>
-                      <w:sz w:val="13"/>
-                      <w:u w:val="none"/>
-                    </w:rPr>
-                    <w:t>SUBLEVEL CAPACITY</w:t>
-                  </w:r>
-                </w:p>
-              </w:tc>
-            </w:tr>
-            <w:tr>
-              <w:tc>
-                <w:tcPr>
-                  <w:tcW w:type="dxa" w:w="2232"/>
-                  <w:vAlign w:val="top"/>
-                  <w:tcMar>
-                    <w:top w:w="20" w:type="dxa"/>
-                    <w:left w:w="0" w:type="dxa"/>
-                    <w:bottom w:w="0" w:type="dxa"/>
-                    <w:right w:w="0" w:type="dxa"/>
-                  </w:tcMar>
-                </w:tcPr>
-                <w:p>
-                  <w:pPr>
-                    <w:spacing w:after="0"/>
-                  </w:pPr>
-                  <w:r>
-                    <w:drawing>
-                      <wp:inline xmlns:a="http://schemas.openxmlformats.org/drawingml/2006/main" xmlns:pic="http://schemas.openxmlformats.org/drawingml/2006/picture">
-                        <wp:extent cx="1034341" cy="1188720"/>
-                        <wp:docPr id="1" name="Picture 1"/>
-                        <wp:cNvGraphicFramePr>
-                          <a:graphicFrameLocks noChangeAspect="1"/>
-                        </wp:cNvGraphicFramePr>
-                        <a:graphic>
-                          <a:graphicData uri="http://schemas.openxmlformats.org/drawingml/2006/picture">
-                            <pic:pic>
-                              <pic:nvPicPr>
-                                <pic:cNvPr id="0" name="u02_reference_diagonal.png"/>
-                                <pic:cNvPicPr/>
-                              </pic:nvPicPr>
-                              <pic:blipFill>
-                                <a:blip r:embed="rId9"/>
-                                <a:stretch>
-                                  <a:fillRect/>
-                                </a:stretch>
-                              </pic:blipFill>
-                              <pic:spPr>
-                                <a:xfrm>
-                                  <a:off x="0" y="0"/>
-                                  <a:ext cx="1034341" cy="1188720"/>
-                                </a:xfrm>
-                                <a:prstGeom prst="rect"/>
-                              </pic:spPr>
-                            </pic:pic>
-                          </a:graphicData>
-                        </a:graphic>
-                      </wp:inline>
-                    </w:drawing>
-                  </w:r>
-                </w:p>
-              </w:tc>
-              <w:tc>
-                <w:tcPr>
-                  <w:tcW w:type="dxa" w:w="2880"/>
-                  <w:vAlign w:val="top"/>
-                  <w:tcMar>
-                    <w:top w:w="40" w:type="dxa"/>
-                    <w:left w:w="60" w:type="dxa"/>
-                    <w:bottom w:w="0" w:type="dxa"/>
-                    <w:right w:w="0" w:type="dxa"/>
-                  </w:tcMar>
-                </w:tcPr>
-                <w:p>
-                  <w:pPr>
-                    <w:tabs>
-                      <w:tab w:pos="720" w:val="left"/>
-                    </w:tabs>
-                    <w:spacing w:after="20"/>
-                  </w:pPr>
-                  <w:r>
-                    <w:rPr>
-                      <w:rFonts w:ascii="Trade Gothic Next" w:hAnsi="Trade Gothic Next"/>
-                      <w:b w:val="0"/>
-                      <w:color w:val="55604F"/>
-                      <w:sz w:val="14"/>
-                      <w:u w:val="none"/>
-                    </w:rPr>
-                    <w:t>Row 1</w:t>
-                  </w:r>
-                  <w:r>
-                    <w:rPr>
-                      <w:rFonts w:ascii="Trade Gothic Next" w:hAnsi="Trade Gothic Next"/>
-                      <w:b/>
-                      <w:color w:val="14161B"/>
-                      <w:sz w:val="16"/>
-                      <w:u w:val="none"/>
-                    </w:rPr>
-                    <w:tab/>
-                    <w:t>1s</w:t>
-                  </w:r>
-                </w:p>
-                <w:p>
-                  <w:pPr>
-                    <w:tabs>
-                      <w:tab w:pos="720" w:val="left"/>
-                    </w:tabs>
-                    <w:spacing w:after="20"/>
-                  </w:pPr>
-                  <w:r>
-                    <w:rPr>
-                      <w:rFonts w:ascii="Trade Gothic Next" w:hAnsi="Trade Gothic Next"/>
-                      <w:b w:val="0"/>
-                      <w:color w:val="55604F"/>
-                      <w:sz w:val="14"/>
-                      <w:u w:val="none"/>
-                    </w:rPr>
-                    <w:t>Row 2</w:t>
-                  </w:r>
-                  <w:r>
-                    <w:rPr>
-                      <w:rFonts w:ascii="Trade Gothic Next" w:hAnsi="Trade Gothic Next"/>
-                      <w:b/>
-                      <w:color w:val="14161B"/>
-                      <w:sz w:val="16"/>
-                      <w:u w:val="none"/>
-                    </w:rPr>
-                    <w:tab/>
-                    <w:t>2s  2p</w:t>
-                  </w:r>
-                </w:p>
-                <w:p>
-                  <w:pPr>
-                    <w:tabs>
-                      <w:tab w:pos="720" w:val="left"/>
-                    </w:tabs>
-                    <w:spacing w:after="20"/>
-                  </w:pPr>
-                  <w:r>
-                    <w:rPr>
-                      <w:rFonts w:ascii="Trade Gothic Next" w:hAnsi="Trade Gothic Next"/>
-                      <w:b w:val="0"/>
-                      <w:color w:val="55604F"/>
-                      <w:sz w:val="14"/>
-                      <w:u w:val="none"/>
-                    </w:rPr>
-                    <w:t>Row 3</w:t>
-                  </w:r>
-                  <w:r>
-                    <w:rPr>
-                      <w:rFonts w:ascii="Trade Gothic Next" w:hAnsi="Trade Gothic Next"/>
-                      <w:b/>
-                      <w:color w:val="14161B"/>
-                      <w:sz w:val="16"/>
-                      <w:u w:val="none"/>
-                    </w:rPr>
-                    <w:tab/>
-                    <w:t>3s  3p</w:t>
-                  </w:r>
-                </w:p>
-                <w:p>
-                  <w:pPr>
-                    <w:tabs>
-                      <w:tab w:pos="720" w:val="left"/>
-                    </w:tabs>
-                    <w:spacing w:after="20"/>
-                  </w:pPr>
-                  <w:r>
-                    <w:rPr>
-                      <w:rFonts w:ascii="Trade Gothic Next" w:hAnsi="Trade Gothic Next"/>
-                      <w:b w:val="0"/>
-                      <w:color w:val="55604F"/>
-                      <w:sz w:val="14"/>
-                      <w:u w:val="none"/>
-                    </w:rPr>
-                    <w:t>Row 4</w:t>
-                  </w:r>
-                  <w:r>
-                    <w:rPr>
-                      <w:rFonts w:ascii="Trade Gothic Next" w:hAnsi="Trade Gothic Next"/>
-                      <w:b/>
-                      <w:color w:val="14161B"/>
-                      <w:sz w:val="16"/>
-                      <w:u w:val="none"/>
-                    </w:rPr>
-                    <w:tab/>
-                    <w:t>4s  3d  4p</w:t>
-                  </w:r>
-                </w:p>
-                <w:p>
-                  <w:pPr>
-                    <w:tabs>
-                      <w:tab w:pos="720" w:val="left"/>
-                    </w:tabs>
-                    <w:spacing w:after="20"/>
-                  </w:pPr>
-                  <w:r>
-                    <w:rPr>
-                      <w:rFonts w:ascii="Trade Gothic Next" w:hAnsi="Trade Gothic Next"/>
-                      <w:b w:val="0"/>
-                      <w:color w:val="55604F"/>
-                      <w:sz w:val="14"/>
-                      <w:u w:val="none"/>
-                    </w:rPr>
-                    <w:t>Row 5</w:t>
-                  </w:r>
-                  <w:r>
-                    <w:rPr>
-                      <w:rFonts w:ascii="Trade Gothic Next" w:hAnsi="Trade Gothic Next"/>
-                      <w:b/>
-                      <w:color w:val="14161B"/>
-                      <w:sz w:val="16"/>
-                      <w:u w:val="none"/>
-                    </w:rPr>
-                    <w:tab/>
-                    <w:t>5s  4d  5p</w:t>
-                  </w:r>
-                </w:p>
-                <w:p>
-                  <w:pPr>
-                    <w:tabs>
-                      <w:tab w:pos="720" w:val="left"/>
-                    </w:tabs>
-                    <w:spacing w:after="20"/>
-                  </w:pPr>
-                  <w:r>
-                    <w:rPr>
-                      <w:rFonts w:ascii="Trade Gothic Next" w:hAnsi="Trade Gothic Next"/>
-                      <w:b w:val="0"/>
-                      <w:color w:val="55604F"/>
-                      <w:sz w:val="14"/>
-                      <w:u w:val="none"/>
-                    </w:rPr>
-                    <w:t>Row 6</w:t>
-                  </w:r>
-                  <w:r>
-                    <w:rPr>
-                      <w:rFonts w:ascii="Trade Gothic Next" w:hAnsi="Trade Gothic Next"/>
-                      <w:b/>
-                      <w:color w:val="14161B"/>
-                      <w:sz w:val="16"/>
-                      <w:u w:val="none"/>
-                    </w:rPr>
-                    <w:tab/>
-                    <w:t>6s  4f  5d  6p</w:t>
-                  </w:r>
-                </w:p>
-                <w:p>
-                  <w:pPr>
-                    <w:tabs>
-                      <w:tab w:pos="720" w:val="left"/>
-                    </w:tabs>
-                    <w:spacing w:after="20"/>
-                  </w:pPr>
-                  <w:r>
-                    <w:rPr>
-                      <w:rFonts w:ascii="Trade Gothic Next" w:hAnsi="Trade Gothic Next"/>
-                      <w:b w:val="0"/>
-                      <w:color w:val="55604F"/>
-                      <w:sz w:val="14"/>
-                      <w:u w:val="none"/>
-                    </w:rPr>
-                    <w:t>Row 7</w:t>
-                  </w:r>
-                  <w:r>
-                    <w:rPr>
-                      <w:rFonts w:ascii="Trade Gothic Next" w:hAnsi="Trade Gothic Next"/>
-                      <w:b/>
-                      <w:color w:val="14161B"/>
-                      <w:sz w:val="16"/>
-                      <w:u w:val="none"/>
-                    </w:rPr>
-                    <w:tab/>
-                    <w:t>7s  5f  6d  7p</w:t>
-                  </w:r>
-                </w:p>
-              </w:tc>
-              <w:tc>
-                <w:tcPr>
-                  <w:tcW w:type="dxa" w:w="2592"/>
-                  <w:vAlign w:val="top"/>
-                  <w:tcMar>
-                    <w:top w:w="40" w:type="dxa"/>
-                    <w:left w:w="60" w:type="dxa"/>
-                    <w:bottom w:w="0" w:type="dxa"/>
-                    <w:right w:w="0" w:type="dxa"/>
-                  </w:tcMar>
-                </w:tcPr>
-                <w:p>
-                  <w:pPr>
-                    <w:spacing w:after="0" w:line="20" w:lineRule="exact"/>
-                  </w:pPr>
-                </w:p>
-                <w:tbl>
-                  <w:tblPr>
-                    <w:tblW w:type="auto" w:w="0"/>
-                    <w:tblLayout w:type="fixed"/>
-                    <w:tblLook w:firstColumn="1" w:firstRow="1" w:lastColumn="0" w:lastRow="0" w:noHBand="0" w:noVBand="1" w:val="04A0"/>
-                    <w:tblLayout w:type="fixed"/>
-                  </w:tblPr>
-                  <w:tblGrid>
-                    <w:gridCol w:w="792"/>
-                    <w:gridCol w:w="864"/>
-                    <w:gridCol w:w="792"/>
-                  </w:tblGrid>
-                  <w:tr>
-                    <w:trPr>
-                      <w:cantSplit/>
-                      <w:trHeight w:val="259" w:hRule="exact"/>
-                    </w:trPr>
-                    <w:tc>
-                      <w:tcPr>
-                        <w:tcW w:type="dxa" w:w="792"/>
-                        <w:tcBorders>
-                          <w:bottom w:val="single" w:sz="6" w:color="C8CDC2"/>
-                        </w:tcBorders>
-                        <w:vAlign w:val="center"/>
-                        <w:tcMar>
-                          <w:top w:w="0" w:type="dxa"/>
-                          <w:left w:w="10" w:type="dxa"/>
-                          <w:bottom w:w="0" w:type="dxa"/>
-                          <w:right w:w="10" w:type="dxa"/>
-                        </w:tcMar>
-                      </w:tcPr>
-                      <w:p>
-                        <w:pPr>
-                          <w:spacing w:after="0"/>
-                          <w:jc w:val="center"/>
-                        </w:pPr>
-                      </w:p>
-                    </w:tc>
-                    <w:tc>
-                      <w:tcPr>
-                        <w:tcW w:type="dxa" w:w="864"/>
-                        <w:tcBorders>
-                          <w:bottom w:val="single" w:sz="6" w:color="C8CDC2"/>
-                        </w:tcBorders>
-                        <w:vAlign w:val="center"/>
-                        <w:tcMar>
-                          <w:top w:w="0" w:type="dxa"/>
-                          <w:left w:w="10" w:type="dxa"/>
-                          <w:bottom w:w="0" w:type="dxa"/>
-                          <w:right w:w="10" w:type="dxa"/>
-                        </w:tcMar>
-                      </w:tcPr>
-                      <w:p>
-                        <w:pPr>
-                          <w:spacing w:after="0"/>
-                          <w:jc w:val="center"/>
-                        </w:pPr>
-                        <w:r>
-                          <w:rPr>
-                            <w:rFonts w:ascii="Trade Gothic Next" w:hAnsi="Trade Gothic Next"/>
-                            <w:b/>
-                            <w:color w:val="55604F"/>
-                            <w:sz w:val="13"/>
-                            <w:u w:val="none"/>
-                          </w:rPr>
-                          <w:t>ORBITALS</w:t>
-                        </w:r>
-                      </w:p>
-                    </w:tc>
-                    <w:tc>
-                      <w:tcPr>
-                        <w:tcW w:type="dxa" w:w="792"/>
-                        <w:tcBorders>
-                          <w:bottom w:val="single" w:sz="6" w:color="C8CDC2"/>
-                        </w:tcBorders>
-                        <w:vAlign w:val="center"/>
-                        <w:tcMar>
-                          <w:top w:w="0" w:type="dxa"/>
-                          <w:left w:w="10" w:type="dxa"/>
-                          <w:bottom w:w="0" w:type="dxa"/>
-                          <w:right w:w="10" w:type="dxa"/>
-                        </w:tcMar>
-                      </w:tcPr>
-                      <w:p>
-                        <w:pPr>
-                          <w:spacing w:after="0"/>
-                          <w:jc w:val="center"/>
-                        </w:pPr>
-                        <w:r>
-                          <w:rPr>
-                            <w:rFonts w:ascii="Trade Gothic Next" w:hAnsi="Trade Gothic Next"/>
-                            <w:b/>
-                            <w:color w:val="55604F"/>
-                            <w:sz w:val="13"/>
-                            <w:u w:val="none"/>
-                          </w:rPr>
-                          <w:t>MAX e</w:t>
-                        </w:r>
-                        <w:r>
-                          <w:rPr>
-                            <w:rFonts w:ascii="Trade Gothic Next" w:hAnsi="Trade Gothic Next"/>
-                            <w:b/>
-                            <w:color w:val="55604F"/>
-                            <w:sz w:val="13"/>
-                            <w:u w:val="none"/>
-                            <w:vertAlign w:val="superscript"/>
-                          </w:rPr>
-                          <w:t>−</w:t>
-                        </w:r>
-                      </w:p>
-                    </w:tc>
-                  </w:tr>
-                  <w:tr>
-                    <w:trPr>
-                      <w:cantSplit/>
-                      <w:trHeight w:val="259" w:hRule="exact"/>
-                    </w:trPr>
-                    <w:tc>
-                      <w:tcPr>
-                        <w:tcW w:type="dxa" w:w="792"/>
-                        <w:vAlign w:val="center"/>
-                        <w:tcMar>
-                          <w:top w:w="0" w:type="dxa"/>
-                          <w:left w:w="10" w:type="dxa"/>
-                          <w:bottom w:w="0" w:type="dxa"/>
-                          <w:right w:w="10" w:type="dxa"/>
-                        </w:tcMar>
-                      </w:tcPr>
-                      <w:p>
-                        <w:pPr>
-                          <w:spacing w:after="0"/>
-                          <w:jc w:val="center"/>
-                        </w:pPr>
-                        <w:r>
-                          <w:rPr>
-                            <w:rFonts w:ascii="Trade Gothic Next" w:hAnsi="Trade Gothic Next"/>
-                            <w:b/>
-                            <w:color w:val="4D730E"/>
-                            <w:sz w:val="17"/>
-                            <w:u w:val="none"/>
-                          </w:rPr>
-                          <w:t>s</w:t>
-                        </w:r>
-                      </w:p>
-                    </w:tc>
-                    <w:tc>
-                      <w:tcPr>
-                        <w:tcW w:type="dxa" w:w="864"/>
-                        <w:vAlign w:val="center"/>
-                        <w:tcMar>
-                          <w:top w:w="0" w:type="dxa"/>
-                          <w:left w:w="10" w:type="dxa"/>
-                          <w:bottom w:w="0" w:type="dxa"/>
-                          <w:right w:w="10" w:type="dxa"/>
-                        </w:tcMar>
-                      </w:tcPr>
-                      <w:p>
-                        <w:pPr>
-                          <w:spacing w:after="0"/>
-                          <w:jc w:val="center"/>
-                        </w:pPr>
-                        <w:r>
-                          <w:rPr>
-                            <w:rFonts w:ascii="Trade Gothic Next" w:hAnsi="Trade Gothic Next"/>
-                            <w:b w:val="0"/>
-                            <w:color w:val="14161B"/>
-                            <w:sz w:val="17"/>
-                            <w:u w:val="none"/>
-                          </w:rPr>
-                          <w:t>1</w:t>
-                        </w:r>
-                      </w:p>
-                    </w:tc>
-                    <w:tc>
-                      <w:tcPr>
-                        <w:tcW w:type="dxa" w:w="792"/>
-                        <w:vAlign w:val="center"/>
-                        <w:tcMar>
-                          <w:top w:w="0" w:type="dxa"/>
-                          <w:left w:w="10" w:type="dxa"/>
-                          <w:bottom w:w="0" w:type="dxa"/>
-                          <w:right w:w="10" w:type="dxa"/>
-                        </w:tcMar>
-                      </w:tcPr>
-                      <w:p>
-                        <w:pPr>
-                          <w:spacing w:after="0"/>
-                          <w:jc w:val="center"/>
-                        </w:pPr>
-                        <w:r>
-                          <w:rPr>
-                            <w:rFonts w:ascii="Trade Gothic Next" w:hAnsi="Trade Gothic Next"/>
-                            <w:b w:val="0"/>
-                            <w:color w:val="14161B"/>
-                            <w:sz w:val="17"/>
-                            <w:u w:val="none"/>
-                          </w:rPr>
-                          <w:t>2</w:t>
-                        </w:r>
-                      </w:p>
-                    </w:tc>
-                  </w:tr>
-                  <w:tr>
-                    <w:trPr>
-                      <w:cantSplit/>
-                      <w:trHeight w:val="259" w:hRule="exact"/>
-                    </w:trPr>
-                    <w:tc>
-                      <w:tcPr>
-                        <w:tcW w:type="dxa" w:w="792"/>
-                        <w:vAlign w:val="center"/>
-                        <w:tcMar>
-                          <w:top w:w="0" w:type="dxa"/>
-                          <w:left w:w="10" w:type="dxa"/>
-                          <w:bottom w:w="0" w:type="dxa"/>
-                          <w:right w:w="10" w:type="dxa"/>
-                        </w:tcMar>
-                      </w:tcPr>
-                      <w:p>
-                        <w:pPr>
-                          <w:spacing w:after="0"/>
-                          <w:jc w:val="center"/>
-                        </w:pPr>
-                        <w:r>
-                          <w:rPr>
-                            <w:rFonts w:ascii="Trade Gothic Next" w:hAnsi="Trade Gothic Next"/>
-                            <w:b/>
-                            <w:color w:val="4D730E"/>
-                            <w:sz w:val="17"/>
-                            <w:u w:val="none"/>
-                          </w:rPr>
-                          <w:t>p</w:t>
-                        </w:r>
-                      </w:p>
-                    </w:tc>
-                    <w:tc>
-                      <w:tcPr>
-                        <w:tcW w:type="dxa" w:w="864"/>
-                        <w:vAlign w:val="center"/>
-                        <w:tcMar>
-                          <w:top w:w="0" w:type="dxa"/>
-                          <w:left w:w="10" w:type="dxa"/>
-                          <w:bottom w:w="0" w:type="dxa"/>
-                          <w:right w:w="10" w:type="dxa"/>
-                        </w:tcMar>
-                      </w:tcPr>
-                      <w:p>
-                        <w:pPr>
-                          <w:spacing w:after="0"/>
-                          <w:jc w:val="center"/>
-                        </w:pPr>
-                        <w:r>
-                          <w:rPr>
-                            <w:rFonts w:ascii="Trade Gothic Next" w:hAnsi="Trade Gothic Next"/>
-                            <w:b w:val="0"/>
-                            <w:color w:val="14161B"/>
-                            <w:sz w:val="17"/>
-                            <w:u w:val="none"/>
-                          </w:rPr>
-                          <w:t>3</w:t>
-                        </w:r>
-                      </w:p>
-                    </w:tc>
-                    <w:tc>
-                      <w:tcPr>
-                        <w:tcW w:type="dxa" w:w="792"/>
-                        <w:vAlign w:val="center"/>
-                        <w:tcMar>
-                          <w:top w:w="0" w:type="dxa"/>
-                          <w:left w:w="10" w:type="dxa"/>
-                          <w:bottom w:w="0" w:type="dxa"/>
-                          <w:right w:w="10" w:type="dxa"/>
-                        </w:tcMar>
-                      </w:tcPr>
-                      <w:p>
-                        <w:pPr>
-                          <w:spacing w:after="0"/>
-                          <w:jc w:val="center"/>
-                        </w:pPr>
-                        <w:r>
-                          <w:rPr>
-                            <w:rFonts w:ascii="Trade Gothic Next" w:hAnsi="Trade Gothic Next"/>
-                            <w:b w:val="0"/>
-                            <w:color w:val="14161B"/>
-                            <w:sz w:val="17"/>
-                            <w:u w:val="none"/>
-                          </w:rPr>
-                          <w:t>6</w:t>
-                        </w:r>
-                      </w:p>
-                    </w:tc>
-                  </w:tr>
-                  <w:tr>
-                    <w:trPr>
-                      <w:cantSplit/>
-                      <w:trHeight w:val="259" w:hRule="exact"/>
-                    </w:trPr>
-                    <w:tc>
-                      <w:tcPr>
-                        <w:tcW w:type="dxa" w:w="792"/>
-                        <w:vAlign w:val="center"/>
-                        <w:tcMar>
-                          <w:top w:w="0" w:type="dxa"/>
-                          <w:left w:w="10" w:type="dxa"/>
-                          <w:bottom w:w="0" w:type="dxa"/>
-                          <w:right w:w="10" w:type="dxa"/>
-                        </w:tcMar>
-                      </w:tcPr>
-                      <w:p>
-                        <w:pPr>
-                          <w:spacing w:after="0"/>
-                          <w:jc w:val="center"/>
-                        </w:pPr>
-                        <w:r>
-                          <w:rPr>
-                            <w:rFonts w:ascii="Trade Gothic Next" w:hAnsi="Trade Gothic Next"/>
-                            <w:b/>
-                            <w:color w:val="4D730E"/>
-                            <w:sz w:val="17"/>
-                            <w:u w:val="none"/>
-                          </w:rPr>
-                          <w:t>d</w:t>
-                        </w:r>
-                      </w:p>
-                    </w:tc>
-                    <w:tc>
-                      <w:tcPr>
-                        <w:tcW w:type="dxa" w:w="864"/>
-                        <w:vAlign w:val="center"/>
-                        <w:tcMar>
-                          <w:top w:w="0" w:type="dxa"/>
-                          <w:left w:w="10" w:type="dxa"/>
-                          <w:bottom w:w="0" w:type="dxa"/>
-                          <w:right w:w="10" w:type="dxa"/>
-                        </w:tcMar>
-                      </w:tcPr>
-                      <w:p>
-                        <w:pPr>
-                          <w:spacing w:after="0"/>
-                          <w:jc w:val="center"/>
-                        </w:pPr>
-                        <w:r>
-                          <w:rPr>
-                            <w:rFonts w:ascii="Trade Gothic Next" w:hAnsi="Trade Gothic Next"/>
-                            <w:b w:val="0"/>
-                            <w:color w:val="14161B"/>
-                            <w:sz w:val="17"/>
-                            <w:u w:val="none"/>
-                          </w:rPr>
-                          <w:t>5</w:t>
-                        </w:r>
-                      </w:p>
-                    </w:tc>
-                    <w:tc>
-                      <w:tcPr>
-                        <w:tcW w:type="dxa" w:w="792"/>
-                        <w:vAlign w:val="center"/>
-                        <w:tcMar>
-                          <w:top w:w="0" w:type="dxa"/>
-                          <w:left w:w="10" w:type="dxa"/>
-                          <w:bottom w:w="0" w:type="dxa"/>
-                          <w:right w:w="10" w:type="dxa"/>
-                        </w:tcMar>
-                      </w:tcPr>
-                      <w:p>
-                        <w:pPr>
-                          <w:spacing w:after="0"/>
-                          <w:jc w:val="center"/>
-                        </w:pPr>
-                        <w:r>
-                          <w:rPr>
-                            <w:rFonts w:ascii="Trade Gothic Next" w:hAnsi="Trade Gothic Next"/>
-                            <w:b w:val="0"/>
-                            <w:color w:val="14161B"/>
-                            <w:sz w:val="17"/>
-                            <w:u w:val="none"/>
-                          </w:rPr>
-                          <w:t>10</w:t>
-                        </w:r>
-                      </w:p>
-                    </w:tc>
-                  </w:tr>
-                  <w:tr>
-                    <w:trPr>
-                      <w:cantSplit/>
-                      <w:trHeight w:val="259" w:hRule="exact"/>
-                    </w:trPr>
-                    <w:tc>
-                      <w:tcPr>
-                        <w:tcW w:type="dxa" w:w="792"/>
-                        <w:vAlign w:val="center"/>
-                        <w:tcMar>
-                          <w:top w:w="0" w:type="dxa"/>
-                          <w:left w:w="10" w:type="dxa"/>
-                          <w:bottom w:w="0" w:type="dxa"/>
-                          <w:right w:w="10" w:type="dxa"/>
-                        </w:tcMar>
-                      </w:tcPr>
-                      <w:p>
-                        <w:pPr>
-                          <w:spacing w:after="0"/>
-                          <w:jc w:val="center"/>
-                        </w:pPr>
-                        <w:r>
-                          <w:rPr>
-                            <w:rFonts w:ascii="Trade Gothic Next" w:hAnsi="Trade Gothic Next"/>
-                            <w:b/>
-                            <w:color w:val="4D730E"/>
-                            <w:sz w:val="17"/>
-                            <w:u w:val="none"/>
-                          </w:rPr>
-                          <w:t>f</w:t>
-                        </w:r>
-                      </w:p>
-                    </w:tc>
-                    <w:tc>
-                      <w:tcPr>
-                        <w:tcW w:type="dxa" w:w="864"/>
-                        <w:vAlign w:val="center"/>
-                        <w:tcMar>
-                          <w:top w:w="0" w:type="dxa"/>
-                          <w:left w:w="10" w:type="dxa"/>
-                          <w:bottom w:w="0" w:type="dxa"/>
-                          <w:right w:w="10" w:type="dxa"/>
-                        </w:tcMar>
-                      </w:tcPr>
-                      <w:p>
-                        <w:pPr>
-                          <w:spacing w:after="0"/>
-                          <w:jc w:val="center"/>
-                        </w:pPr>
-                        <w:r>
-                          <w:rPr>
-                            <w:rFonts w:ascii="Trade Gothic Next" w:hAnsi="Trade Gothic Next"/>
-                            <w:b w:val="0"/>
-                            <w:color w:val="14161B"/>
-                            <w:sz w:val="17"/>
-                            <w:u w:val="none"/>
-                          </w:rPr>
-                          <w:t>7</w:t>
-                        </w:r>
-                      </w:p>
-                    </w:tc>
-                    <w:tc>
-                      <w:tcPr>
-                        <w:tcW w:type="dxa" w:w="792"/>
-                        <w:vAlign w:val="center"/>
-                        <w:tcMar>
-                          <w:top w:w="0" w:type="dxa"/>
-                          <w:left w:w="10" w:type="dxa"/>
-                          <w:bottom w:w="0" w:type="dxa"/>
-                          <w:right w:w="10" w:type="dxa"/>
-                        </w:tcMar>
-                      </w:tcPr>
-                      <w:p>
-                        <w:pPr>
-                          <w:spacing w:after="0"/>
-                          <w:jc w:val="center"/>
-                        </w:pPr>
-                        <w:r>
-                          <w:rPr>
-                            <w:rFonts w:ascii="Trade Gothic Next" w:hAnsi="Trade Gothic Next"/>
-                            <w:b w:val="0"/>
-                            <w:color w:val="14161B"/>
-                            <w:sz w:val="17"/>
-                            <w:u w:val="none"/>
-                          </w:rPr>
-                          <w:t>14</w:t>
-                        </w:r>
-                      </w:p>
-                    </w:tc>
-                  </w:tr>
-                </w:tbl>
-                <w:p/>
-              </w:tc>
-            </w:tr>
-          </w:tbl>
-          <w:p/>
+          <w:p>
+            <w:pPr>
+              <w:spacing w:after="40"/>
+              <w:jc w:val="center"/>
+            </w:pPr>
+            <w:r>
+              <w:rPr>
+                <w:rFonts w:ascii="Trade Gothic Next" w:hAnsi="Trade Gothic Next"/>
+                <w:b/>
+                <w:color w:val="4D730E"/>
+                <w:sz w:val="14"/>
+                <w:u w:val="none"/>
+              </w:rPr>
+              <w:t xml:space="preserve">DIAGONAL RULE  </w:t>
+            </w:r>
+            <w:r>
+              <w:rPr>
+                <w:rFonts w:ascii="Trade Gothic Next" w:hAnsi="Trade Gothic Next"/>
+                <w:b w:val="0"/>
+                <w:color w:val="55604F"/>
+                <w:sz w:val="14"/>
+                <w:u w:val="none"/>
+              </w:rPr>
+              <w:t>follow each arrow, top to bottom, to fill the sublevels in order</w:t>
+            </w:r>
+          </w:p>
+          <w:p>
+            <w:pPr>
+              <w:spacing w:after="0"/>
+              <w:jc w:val="center"/>
+            </w:pPr>
+            <w:r>
+              <w:drawing>
+                <wp:inline xmlns:a="http://schemas.openxmlformats.org/drawingml/2006/main" xmlns:pic="http://schemas.openxmlformats.org/drawingml/2006/picture">
+                  <wp:extent cx="1153688" cy="1325880"/>
+                  <wp:docPr id="1" name="Picture 1"/>
+                  <wp:cNvGraphicFramePr>
+                    <a:graphicFrameLocks noChangeAspect="1"/>
+                  </wp:cNvGraphicFramePr>
+                  <a:graphic>
+                    <a:graphicData uri="http://schemas.openxmlformats.org/drawingml/2006/picture">
+                      <pic:pic>
+                        <pic:nvPicPr>
+                          <pic:cNvPr id="0" name="u02_reference_diagonal.png"/>
+                          <pic:cNvPicPr/>
+                        </pic:nvPicPr>
+                        <pic:blipFill>
+                          <a:blip r:embed="rId9"/>
+                          <a:stretch>
+                            <a:fillRect/>
+                          </a:stretch>
+                        </pic:blipFill>
+                        <pic:spPr>
+                          <a:xfrm>
+                            <a:off x="0" y="0"/>
+                            <a:ext cx="1153688" cy="1325880"/>
+                          </a:xfrm>
+                          <a:prstGeom prst="rect"/>
+                        </pic:spPr>
+                      </pic:pic>
+                    </a:graphicData>
+                  </a:graphic>
+                </wp:inline>
+              </w:drawing>
+            </w:r>
+          </w:p>
         </w:tc>
         <w:tc>
           <w:tcPr>

</xml_diff>